<commit_message>
add DJI sensor data mat file log
</commit_message>
<xml_diff>
--- a/Localization.docx
+++ b/Localization.docx
@@ -679,6 +679,7 @@
         </w:rPr>
       </w:pPr>
       <w:bookmarkStart w:id="0" w:name="_Toc223882359"/>
+      <w:proofErr w:type="spellStart"/>
       <w:r>
         <w:rPr>
           <w:lang w:val="en-US"/>
@@ -692,6 +693,7 @@
         <w:t>Localization</w:t>
       </w:r>
       <w:bookmarkEnd w:id="0"/>
+      <w:proofErr w:type="spellEnd"/>
     </w:p>
     <w:p>
       <w:pPr>
@@ -733,7 +735,21 @@
         <w:rPr>
           <w:lang w:val="en-US"/>
         </w:rPr>
-        <w:t xml:space="preserve">This file is used to </w:t>
+        <w:t xml:space="preserve">This file is </w:t>
+      </w:r>
+      <w:proofErr w:type="gramStart"/>
+      <w:r>
+        <w:rPr>
+          <w:lang w:val="en-US"/>
+        </w:rPr>
+        <w:t>used to</w:t>
+      </w:r>
+      <w:proofErr w:type="gramEnd"/>
+      <w:r>
+        <w:rPr>
+          <w:lang w:val="en-US"/>
+        </w:rPr>
+        <w:t xml:space="preserve"> </w:t>
       </w:r>
       <w:r>
         <w:rPr>
@@ -850,6 +866,7 @@
         </w:rPr>
         <w:t xml:space="preserve">HSI scan contains in total four rows with </w:t>
       </w:r>
+      <w:proofErr w:type="gramStart"/>
       <w:r>
         <w:rPr>
           <w:lang w:val="en-US"/>
@@ -860,7 +877,14 @@
         <w:rPr>
           <w:lang w:val="en-US"/>
         </w:rPr>
-        <w:t xml:space="preserve">  overlapping scans.</w:t>
+        <w:t xml:space="preserve">  overlapping</w:t>
+      </w:r>
+      <w:proofErr w:type="gramEnd"/>
+      <w:r>
+        <w:rPr>
+          <w:lang w:val="en-US"/>
+        </w:rPr>
+        <w:t xml:space="preserve"> scans.</w:t>
       </w:r>
     </w:p>
     <w:p>
@@ -902,7 +926,21 @@
         <w:rPr>
           <w:lang w:val="en-US"/>
         </w:rPr>
-        <w:t>See details of file associated with each rows in</w:t>
+        <w:t xml:space="preserve">See details of file associated with each </w:t>
+      </w:r>
+      <w:proofErr w:type="gramStart"/>
+      <w:r>
+        <w:rPr>
+          <w:lang w:val="en-US"/>
+        </w:rPr>
+        <w:t>rows</w:t>
+      </w:r>
+      <w:proofErr w:type="gramEnd"/>
+      <w:r>
+        <w:rPr>
+          <w:lang w:val="en-US"/>
+        </w:rPr>
+        <w:t xml:space="preserve"> in</w:t>
       </w:r>
       <w:r>
         <w:rPr>
@@ -932,8 +970,9 @@
           <w:highlight w:val="green"/>
           <w:lang w:val="en-US"/>
         </w:rPr>
-        <w:t>D:\00-Workspace\OneDrive - University of Regina\00-Workstation(UoR)\00-Research_Work\04-HSI_Localization\01-Localization\</w:t>
-      </w:r>
+        <w:t>D:\00-Workspace\OneDrive - University of Regina\00-</w:t>
+      </w:r>
+      <w:proofErr w:type="gramStart"/>
       <w:r>
         <w:rPr>
           <w:sz w:val="18"/>
@@ -941,8 +980,9 @@
           <w:highlight w:val="green"/>
           <w:lang w:val="en-US"/>
         </w:rPr>
-        <w:t>HSI_Libraries.docx</w:t>
-      </w:r>
+        <w:t>Workstation(</w:t>
+      </w:r>
+      <w:proofErr w:type="gramEnd"/>
       <w:r>
         <w:rPr>
           <w:sz w:val="18"/>
@@ -950,26 +990,26 @@
           <w:highlight w:val="green"/>
           <w:lang w:val="en-US"/>
         </w:rPr>
-        <w:t xml:space="preserve"> </w:t>
-      </w:r>
-    </w:p>
-    <w:p>
-      <w:pPr>
+        <w:t>UoR)\00-Research_Work\04-HSI_Localization\01-Localization\</w:t>
+      </w:r>
+      <w:r>
         <w:rPr>
           <w:sz w:val="18"/>
           <w:szCs w:val="18"/>
-          <w:lang w:val="en-US"/>
-        </w:rPr>
-      </w:pPr>
-    </w:p>
-    <w:p>
-      <w:pPr>
+          <w:highlight w:val="green"/>
+          <w:lang w:val="en-US"/>
+        </w:rPr>
+        <w:t>HSI_Libraries.docx</w:t>
+      </w:r>
+      <w:r>
         <w:rPr>
           <w:sz w:val="18"/>
           <w:szCs w:val="18"/>
-          <w:lang w:val="en-US"/>
-        </w:rPr>
-      </w:pPr>
+          <w:highlight w:val="green"/>
+          <w:lang w:val="en-US"/>
+        </w:rPr>
+        <w:t xml:space="preserve"> </w:t>
+      </w:r>
     </w:p>
     <w:p>
       <w:pPr>
@@ -1000,6 +1040,24 @@
     </w:p>
     <w:p>
       <w:pPr>
+        <w:rPr>
+          <w:sz w:val="18"/>
+          <w:szCs w:val="18"/>
+          <w:lang w:val="en-US"/>
+        </w:rPr>
+      </w:pPr>
+    </w:p>
+    <w:p>
+      <w:pPr>
+        <w:rPr>
+          <w:sz w:val="18"/>
+          <w:szCs w:val="18"/>
+          <w:lang w:val="en-US"/>
+        </w:rPr>
+      </w:pPr>
+    </w:p>
+    <w:p>
+      <w:pPr>
         <w:pStyle w:val="Heading2"/>
         <w:rPr>
           <w:lang w:val="en-US"/>
@@ -1024,9 +1082,11 @@
       <w:pPr>
         <w:pStyle w:val="Heading3"/>
       </w:pPr>
+      <w:proofErr w:type="spellStart"/>
       <w:r>
         <w:t>Localization_Tools</w:t>
       </w:r>
+      <w:proofErr w:type="spellEnd"/>
     </w:p>
     <w:p>
       <w:pPr>
@@ -1106,9 +1166,11 @@
       <w:pPr>
         <w:pStyle w:val="Heading3"/>
       </w:pPr>
+      <w:proofErr w:type="spellStart"/>
       <w:r>
         <w:t>LCF_DJI_Synchronization</w:t>
       </w:r>
+      <w:proofErr w:type="spellEnd"/>
     </w:p>
     <w:p>
       <w:pPr>
@@ -1145,13 +1207,49 @@
         <w:rPr>
           <w:lang w:val="en-US"/>
         </w:rPr>
-        <w:t xml:space="preserve"> it synchronize bil.time file with </w:t>
-      </w:r>
-      <w:r>
-        <w:rPr>
-          <w:lang w:val="en-US"/>
-        </w:rPr>
-        <w:t>lcf file</w:t>
+        <w:t xml:space="preserve"> it </w:t>
+      </w:r>
+      <w:proofErr w:type="gramStart"/>
+      <w:r>
+        <w:rPr>
+          <w:lang w:val="en-US"/>
+        </w:rPr>
+        <w:t>synchronize</w:t>
+      </w:r>
+      <w:proofErr w:type="gramEnd"/>
+      <w:r>
+        <w:rPr>
+          <w:lang w:val="en-US"/>
+        </w:rPr>
+        <w:t xml:space="preserve"> </w:t>
+      </w:r>
+      <w:proofErr w:type="spellStart"/>
+      <w:r>
+        <w:rPr>
+          <w:lang w:val="en-US"/>
+        </w:rPr>
+        <w:t>bil.time</w:t>
+      </w:r>
+      <w:proofErr w:type="spellEnd"/>
+      <w:r>
+        <w:rPr>
+          <w:lang w:val="en-US"/>
+        </w:rPr>
+        <w:t xml:space="preserve"> file with </w:t>
+      </w:r>
+      <w:proofErr w:type="spellStart"/>
+      <w:r>
+        <w:rPr>
+          <w:lang w:val="en-US"/>
+        </w:rPr>
+        <w:t>lcf</w:t>
+      </w:r>
+      <w:proofErr w:type="spellEnd"/>
+      <w:r>
+        <w:rPr>
+          <w:lang w:val="en-US"/>
+        </w:rPr>
+        <w:t xml:space="preserve"> file</w:t>
       </w:r>
       <w:r>
         <w:rPr>
@@ -1193,7 +1291,21 @@
         <w:rPr>
           <w:lang w:val="en-US"/>
         </w:rPr>
-        <w:t>No Time offset between LCF and Bil.times file</w:t>
+        <w:t xml:space="preserve">No Time offset between LCF and </w:t>
+      </w:r>
+      <w:proofErr w:type="spellStart"/>
+      <w:r>
+        <w:rPr>
+          <w:lang w:val="en-US"/>
+        </w:rPr>
+        <w:t>Bil.times</w:t>
+      </w:r>
+      <w:proofErr w:type="spellEnd"/>
+      <w:r>
+        <w:rPr>
+          <w:lang w:val="en-US"/>
+        </w:rPr>
+        <w:t xml:space="preserve"> file</w:t>
       </w:r>
       <w:r>
         <w:rPr>
@@ -1298,7 +1410,21 @@
         <w:rPr>
           <w:lang w:val="en-US"/>
         </w:rPr>
-        <w:t>Output at step 1 is synch with DJI_Flight path.</w:t>
+        <w:t xml:space="preserve">Output at step 1 is synch with </w:t>
+      </w:r>
+      <w:proofErr w:type="spellStart"/>
+      <w:r>
+        <w:rPr>
+          <w:lang w:val="en-US"/>
+        </w:rPr>
+        <w:t>DJI_Flight</w:t>
+      </w:r>
+      <w:proofErr w:type="spellEnd"/>
+      <w:r>
+        <w:rPr>
+          <w:lang w:val="en-US"/>
+        </w:rPr>
+        <w:t xml:space="preserve"> path.</w:t>
       </w:r>
     </w:p>
     <w:p>
@@ -1312,11 +1438,33 @@
           <w:lang w:val="en-US"/>
         </w:rPr>
       </w:pPr>
-      <w:r>
-        <w:rPr>
-          <w:lang w:val="en-US"/>
-        </w:rPr>
-        <w:t>DJI_Flight path update accurate position (RTK)</w:t>
+      <w:proofErr w:type="spellStart"/>
+      <w:r>
+        <w:rPr>
+          <w:lang w:val="en-US"/>
+        </w:rPr>
+        <w:t>DJI_Flight</w:t>
+      </w:r>
+      <w:proofErr w:type="spellEnd"/>
+      <w:r>
+        <w:rPr>
+          <w:lang w:val="en-US"/>
+        </w:rPr>
+        <w:t xml:space="preserve"> path </w:t>
+      </w:r>
+      <w:proofErr w:type="gramStart"/>
+      <w:r>
+        <w:rPr>
+          <w:lang w:val="en-US"/>
+        </w:rPr>
+        <w:t>update</w:t>
+      </w:r>
+      <w:proofErr w:type="gramEnd"/>
+      <w:r>
+        <w:rPr>
+          <w:lang w:val="en-US"/>
+        </w:rPr>
+        <w:t xml:space="preserve"> accurate position (RTK)</w:t>
       </w:r>
     </w:p>
     <w:p>
@@ -1415,8 +1563,13 @@
         <w:t>Assumption, Assuming RTK time more accurate compared to HSI System.</w:t>
       </w:r>
       <w:r>
-        <w:t xml:space="preserve"> Reason is unknows</w:t>
-      </w:r>
+        <w:t xml:space="preserve"> Reason </w:t>
+      </w:r>
+      <w:proofErr w:type="gramStart"/>
+      <w:r>
+        <w:t>is unknows</w:t>
+      </w:r>
+      <w:proofErr w:type="gramEnd"/>
     </w:p>
     <w:p>
       <w:pPr>
@@ -1468,11 +1621,24 @@
       <w:r>
         <w:t xml:space="preserve">It has </w:t>
       </w:r>
-      <w:r>
-        <w:t>an two estimated</w:t>
-      </w:r>
-      <w:r>
-        <w:t xml:space="preserve"> orientation based on</w:t>
+      <w:proofErr w:type="gramStart"/>
+      <w:r>
+        <w:t>an</w:t>
+      </w:r>
+      <w:proofErr w:type="gramEnd"/>
+      <w:r>
+        <w:t xml:space="preserve"> two estimated</w:t>
+      </w:r>
+      <w:r>
+        <w:t xml:space="preserve"> </w:t>
+      </w:r>
+      <w:proofErr w:type="gramStart"/>
+      <w:r>
+        <w:t>orientation</w:t>
+      </w:r>
+      <w:proofErr w:type="gramEnd"/>
+      <w:r>
+        <w:t xml:space="preserve"> based on</w:t>
       </w:r>
     </w:p>
     <w:p>
@@ -1525,9 +1691,11 @@
       <w:r>
         <w:t xml:space="preserve">Output file: </w:t>
       </w:r>
+      <w:proofErr w:type="spellStart"/>
       <w:r>
         <w:t>Path_Synch_Data.kml</w:t>
       </w:r>
+      <w:proofErr w:type="spellEnd"/>
     </w:p>
     <w:p>
       <w:pPr>
@@ -1656,6 +1824,7 @@
         </w:rPr>
       </w:pPr>
       <w:bookmarkStart w:id="2" w:name="_Toc223882361"/>
+      <w:proofErr w:type="spellStart"/>
       <w:r>
         <w:rPr>
           <w:lang w:val="en-US"/>
@@ -1669,18 +1838,90 @@
         <w:t>UAV_Localization.jnpnb</w:t>
       </w:r>
       <w:bookmarkEnd w:id="2"/>
-    </w:p>
-    <w:p>
-      <w:pPr>
-        <w:rPr>
-          <w:lang w:val="en-US"/>
-        </w:rPr>
-      </w:pPr>
-    </w:p>
-    <w:p>
-      <w:r>
-        <w:t>hsi_localization.synchronize_DJI_LCF(lcf_file, bil_folder, dji_file, output_path, prefix, file_numbers, time_offset )</w:t>
-      </w:r>
+      <w:proofErr w:type="spellEnd"/>
+    </w:p>
+    <w:p>
+      <w:pPr>
+        <w:rPr>
+          <w:lang w:val="en-US"/>
+        </w:rPr>
+      </w:pPr>
+    </w:p>
+    <w:p>
+      <w:proofErr w:type="spellStart"/>
+      <w:r>
+        <w:t>hsi_</w:t>
+      </w:r>
+      <w:proofErr w:type="gramStart"/>
+      <w:r>
+        <w:t>localization.synchronize</w:t>
+      </w:r>
+      <w:proofErr w:type="gramEnd"/>
+      <w:r>
+        <w:t>_DJI_</w:t>
+      </w:r>
+      <w:proofErr w:type="gramStart"/>
+      <w:r>
+        <w:t>LCF</w:t>
+      </w:r>
+      <w:proofErr w:type="spellEnd"/>
+      <w:r>
+        <w:t>(</w:t>
+      </w:r>
+      <w:proofErr w:type="spellStart"/>
+      <w:proofErr w:type="gramEnd"/>
+      <w:r>
+        <w:t>lcf_file</w:t>
+      </w:r>
+      <w:proofErr w:type="spellEnd"/>
+      <w:r>
+        <w:t xml:space="preserve">, </w:t>
+      </w:r>
+      <w:proofErr w:type="spellStart"/>
+      <w:r>
+        <w:t>bil_folder</w:t>
+      </w:r>
+      <w:proofErr w:type="spellEnd"/>
+      <w:r>
+        <w:t xml:space="preserve">, </w:t>
+      </w:r>
+      <w:proofErr w:type="spellStart"/>
+      <w:r>
+        <w:t>dji_file</w:t>
+      </w:r>
+      <w:proofErr w:type="spellEnd"/>
+      <w:r>
+        <w:t xml:space="preserve">, </w:t>
+      </w:r>
+      <w:proofErr w:type="spellStart"/>
+      <w:r>
+        <w:t>output_path</w:t>
+      </w:r>
+      <w:proofErr w:type="spellEnd"/>
+      <w:r>
+        <w:t xml:space="preserve">, prefix, </w:t>
+      </w:r>
+      <w:proofErr w:type="spellStart"/>
+      <w:r>
+        <w:t>file_numbers</w:t>
+      </w:r>
+      <w:proofErr w:type="spellEnd"/>
+      <w:r>
+        <w:t xml:space="preserve">, </w:t>
+      </w:r>
+      <w:proofErr w:type="spellStart"/>
+      <w:r>
+        <w:t>time_</w:t>
+      </w:r>
+      <w:proofErr w:type="gramStart"/>
+      <w:r>
+        <w:t>offset</w:t>
+      </w:r>
+      <w:proofErr w:type="spellEnd"/>
+      <w:r>
+        <w:t xml:space="preserve"> )</w:t>
+      </w:r>
+      <w:proofErr w:type="gramEnd"/>
     </w:p>
     <w:p>
       <w:r>
@@ -1691,7 +1932,15 @@
     <w:p>
       <w:r>
         <w:tab/>
-        <w:t>This also store estimated Orientation  of Drone for camera</w:t>
+        <w:t xml:space="preserve">This also store estimated </w:t>
+      </w:r>
+      <w:proofErr w:type="gramStart"/>
+      <w:r>
+        <w:t>Orientation  of</w:t>
+      </w:r>
+      <w:proofErr w:type="gramEnd"/>
+      <w:r>
+        <w:t xml:space="preserve"> Drone for camera</w:t>
       </w:r>
     </w:p>
     <w:p>
@@ -2291,6 +2540,7 @@
             <w:hideMark/>
           </w:tcPr>
           <w:p>
+            <w:proofErr w:type="spellStart"/>
             <w:r>
               <w:rPr>
                 <w:b/>
@@ -2298,6 +2548,7 @@
               </w:rPr>
               <w:t>vel_east</w:t>
             </w:r>
+            <w:proofErr w:type="spellEnd"/>
           </w:p>
         </w:tc>
         <w:tc>
@@ -2336,6 +2587,7 @@
             <w:hideMark/>
           </w:tcPr>
           <w:p>
+            <w:proofErr w:type="spellStart"/>
             <w:r>
               <w:rPr>
                 <w:b/>
@@ -2343,6 +2595,7 @@
               </w:rPr>
               <w:t>vel_north</w:t>
             </w:r>
+            <w:proofErr w:type="spellEnd"/>
           </w:p>
         </w:tc>
         <w:tc>
@@ -2426,6 +2679,7 @@
             <w:hideMark/>
           </w:tcPr>
           <w:p>
+            <w:proofErr w:type="spellStart"/>
             <w:r>
               <w:rPr>
                 <w:b/>
@@ -2433,6 +2687,7 @@
               </w:rPr>
               <w:t>nav_status</w:t>
             </w:r>
+            <w:proofErr w:type="spellEnd"/>
           </w:p>
         </w:tc>
         <w:tc>
@@ -2516,12 +2771,21 @@
             <w:hideMark/>
           </w:tcPr>
           <w:p>
+            <w:proofErr w:type="spellStart"/>
             <w:r>
               <w:rPr>
                 <w:b/>
                 <w:bCs/>
               </w:rPr>
-              <w:t>frame_index / scanline id</w:t>
+              <w:t>frame_index</w:t>
+            </w:r>
+            <w:proofErr w:type="spellEnd"/>
+            <w:r>
+              <w:rPr>
+                <w:b/>
+                <w:bCs/>
+              </w:rPr>
+              <w:t xml:space="preserve"> / scanline id</w:t>
             </w:r>
           </w:p>
         </w:tc>
@@ -3111,9 +3375,11 @@
             <w:hideMark/>
           </w:tcPr>
           <w:p>
+            <w:proofErr w:type="spellStart"/>
             <w:r>
               <w:t>vel_east</w:t>
             </w:r>
+            <w:proofErr w:type="spellEnd"/>
           </w:p>
         </w:tc>
         <w:tc>
@@ -3165,9 +3431,11 @@
             <w:hideMark/>
           </w:tcPr>
           <w:p>
+            <w:proofErr w:type="spellStart"/>
             <w:r>
               <w:t>vel_north</w:t>
             </w:r>
+            <w:proofErr w:type="spellEnd"/>
           </w:p>
         </w:tc>
         <w:tc>
@@ -3273,9 +3541,11 @@
             <w:hideMark/>
           </w:tcPr>
           <w:p>
+            <w:proofErr w:type="spellStart"/>
             <w:r>
               <w:t>nav_status</w:t>
             </w:r>
+            <w:proofErr w:type="spellEnd"/>
           </w:p>
         </w:tc>
         <w:tc>
@@ -3327,9 +3597,11 @@
             <w:hideMark/>
           </w:tcPr>
           <w:p>
+            <w:proofErr w:type="spellStart"/>
             <w:r>
               <w:t>quality_flag</w:t>
             </w:r>
+            <w:proofErr w:type="spellEnd"/>
           </w:p>
         </w:tc>
         <w:tc>
@@ -3381,9 +3653,11 @@
             <w:hideMark/>
           </w:tcPr>
           <w:p>
+            <w:proofErr w:type="spellStart"/>
             <w:r>
               <w:t>scanline_index</w:t>
             </w:r>
+            <w:proofErr w:type="spellEnd"/>
           </w:p>
         </w:tc>
         <w:tc>
@@ -3422,8 +3696,16 @@
         <w:rPr>
           <w:lang w:val="en-US"/>
         </w:rPr>
-        <w:t>In case of Applanix</w:t>
-      </w:r>
+        <w:t xml:space="preserve">In case of </w:t>
+      </w:r>
+      <w:proofErr w:type="spellStart"/>
+      <w:r>
+        <w:rPr>
+          <w:lang w:val="en-US"/>
+        </w:rPr>
+        <w:t>Applanix</w:t>
+      </w:r>
+      <w:proofErr w:type="spellEnd"/>
     </w:p>
     <w:tbl>
       <w:tblPr>
@@ -3942,9 +4224,11 @@
             <w:hideMark/>
           </w:tcPr>
           <w:p>
+            <w:proofErr w:type="spellStart"/>
             <w:r>
               <w:t>vel_north</w:t>
             </w:r>
+            <w:proofErr w:type="spellEnd"/>
           </w:p>
         </w:tc>
         <w:tc>
@@ -3996,9 +4280,11 @@
             <w:hideMark/>
           </w:tcPr>
           <w:p>
+            <w:proofErr w:type="spellStart"/>
             <w:r>
               <w:t>vel_east</w:t>
             </w:r>
+            <w:proofErr w:type="spellEnd"/>
           </w:p>
         </w:tc>
         <w:tc>
@@ -4050,9 +4336,11 @@
             <w:hideMark/>
           </w:tcPr>
           <w:p>
+            <w:proofErr w:type="spellStart"/>
             <w:r>
               <w:t>vel_down</w:t>
             </w:r>
+            <w:proofErr w:type="spellEnd"/>
           </w:p>
         </w:tc>
         <w:tc>
@@ -4104,9 +4392,11 @@
             <w:hideMark/>
           </w:tcPr>
           <w:p>
+            <w:proofErr w:type="spellStart"/>
             <w:r>
               <w:t>ang_rate_x</w:t>
             </w:r>
+            <w:proofErr w:type="spellEnd"/>
           </w:p>
         </w:tc>
         <w:tc>
@@ -4158,9 +4448,11 @@
             <w:hideMark/>
           </w:tcPr>
           <w:p>
+            <w:proofErr w:type="spellStart"/>
             <w:r>
               <w:t>ang_rate_y</w:t>
             </w:r>
+            <w:proofErr w:type="spellEnd"/>
           </w:p>
         </w:tc>
         <w:tc>
@@ -4212,9 +4504,11 @@
             <w:hideMark/>
           </w:tcPr>
           <w:p>
+            <w:proofErr w:type="spellStart"/>
             <w:r>
               <w:t>ang_rate_z</w:t>
             </w:r>
+            <w:proofErr w:type="spellEnd"/>
           </w:p>
         </w:tc>
         <w:tc>
@@ -4266,9 +4560,11 @@
             <w:hideMark/>
           </w:tcPr>
           <w:p>
+            <w:proofErr w:type="spellStart"/>
             <w:r>
               <w:t>acc_x</w:t>
             </w:r>
+            <w:proofErr w:type="spellEnd"/>
           </w:p>
         </w:tc>
         <w:tc>
@@ -4320,9 +4616,11 @@
             <w:hideMark/>
           </w:tcPr>
           <w:p>
+            <w:proofErr w:type="spellStart"/>
             <w:r>
               <w:t>acc_y</w:t>
             </w:r>
+            <w:proofErr w:type="spellEnd"/>
           </w:p>
         </w:tc>
         <w:tc>
@@ -4374,9 +4672,11 @@
             <w:hideMark/>
           </w:tcPr>
           <w:p>
+            <w:proofErr w:type="spellStart"/>
             <w:r>
               <w:t>acc_z</w:t>
             </w:r>
+            <w:proofErr w:type="spellEnd"/>
           </w:p>
         </w:tc>
         <w:tc>
@@ -4428,9 +4728,11 @@
             <w:hideMark/>
           </w:tcPr>
           <w:p>
+            <w:proofErr w:type="spellStart"/>
             <w:r>
               <w:t>gps_week</w:t>
             </w:r>
+            <w:proofErr w:type="spellEnd"/>
           </w:p>
         </w:tc>
         <w:tc>
@@ -4482,9 +4784,11 @@
             <w:hideMark/>
           </w:tcPr>
           <w:p>
+            <w:proofErr w:type="spellStart"/>
             <w:r>
               <w:t>gps_seconds</w:t>
             </w:r>
+            <w:proofErr w:type="spellEnd"/>
           </w:p>
         </w:tc>
         <w:tc>
@@ -4536,9 +4840,11 @@
             <w:hideMark/>
           </w:tcPr>
           <w:p>
+            <w:proofErr w:type="spellStart"/>
             <w:r>
               <w:t>nav_status</w:t>
             </w:r>
+            <w:proofErr w:type="spellEnd"/>
           </w:p>
         </w:tc>
         <w:tc>

</xml_diff>